<commit_message>
Updated the word file with correction to run commands
</commit_message>
<xml_diff>
--- a/c/os-project2/writeup.docx
+++ b/c/os-project2/writeup.docx
@@ -1197,7 +1197,6 @@
         <w:rPr>
           <w:color w:val="4472C4" w:themeColor="accent1"/>
         </w:rPr>
-        <w:lastRenderedPageBreak/>
         <w:t>2</w:t>
       </w:r>
       <w:r>
@@ -1396,11 +1395,6 @@
         <w:t xml:space="preserve">  sudo dmesg -T | tail -20</w:t>
       </w:r>
     </w:p>
-    <w:p>
-      <w:r>
-        <w:t xml:space="preserve">  sudo rmmod print_self</w:t>
-      </w:r>
-    </w:p>
     <w:p/>
     <w:p>
       <w:pPr>
@@ -1574,17 +1568,11 @@
       </w:r>
     </w:p>
     <w:p>
-      <w:r>
-        <w:t>sudo rmmod print_other</w:t>
-      </w:r>
-    </w:p>
-    <w:p>
       <w:pPr>
         <w:pStyle w:val="Heading1"/>
         <w:jc w:val="center"/>
       </w:pPr>
       <w:r>
-        <w:lastRenderedPageBreak/>
         <w:t xml:space="preserve">Part </w:t>
       </w:r>
       <w:r>
@@ -1881,7 +1869,11 @@
     </w:p>
     <w:p>
       <w:r>
-        <w:t>This shows me loading each module from parts one, two, and three. When I loaded hello and searched for it with dmesg it shows the print message I have defined in the code using printk(). When I loaded print_self it immediately recursively gets the PID of each parent task and prints the state of each task. For print_other I have it an argument of pid=$$ which is the PID of the current shell im using. This will recursively look at each parent process and print them out the same way. Then I moved into removing the kernel modules and you can see the goodbye message as well as print_self and print_other showing unloaded.</w:t>
+        <w:t xml:space="preserve">This shows me loading each module from parts one, two, and three. When I loaded hello and searched for it with dmesg it shows the print message I have defined in the code using printk(). When I loaded print_self it immediately recursively gets the PID of each parent task and prints </w:t>
+      </w:r>
+      <w:r>
+        <w:lastRenderedPageBreak/>
+        <w:t>the state of each task. For print_other I have it an argument of pid=$$ which is the PID of the current shell im using. This will recursively look at each parent process and print them out the same way. Then I moved into removing the kernel modules and you can see the goodbye message as well as print_self and print_other showing unloaded.</w:t>
       </w:r>
     </w:p>
     <w:p>

</xml_diff>